<commit_message>
Quitar el bloqueo a Conocernos, cronograma solo instructor, comparador distinto y material de aula.
Co-authored-by: Cursor <cursoragent@cursor.com>
</commit_message>
<xml_diff>
--- a/Manual-de-Prompts.docx
+++ b/Manual-de-Prompts.docx
@@ -13,7 +13,7 @@
           <w:sz w:val="44"/>
           <w:szCs w:val="44"/>
         </w:rPr>
-        <w:t xml:space="preserve">Manual de prompts</w:t>
+        <w:t xml:space="preserve">Manual de prompts — casos de uso</w:t>
       </w:r>
     </w:p>
     <w:p>
@@ -22,6 +22,68 @@
       </w:pPr>
       <w:r>
         <w:t xml:space="preserve">Un prompt es un encargo de trabajo, no un hechizo. Cinco piezas: Rol, Contexto, Objetivo, Formato, Restricciones.</w:t>
+      </w:r>
+    </w:p>
+    <w:p>
+      <w:pPr>
+        <w:spacing w:after="120" w:before="120"/>
+      </w:pPr>
+      <w:r>
+        <w:rPr>
+          <w:b/>
+          <w:color w:val="610A8B"/>
+          <w:sz w:val="30"/>
+          <w:szCs w:val="30"/>
+        </w:rPr>
+        <w:t xml:space="preserve">Casos para copiar (anonimos)</w:t>
+      </w:r>
+    </w:p>
+    <w:p>
+      <w:pPr>
+        <w:numPr>
+          <w:ilvl w:val="0"/>
+          <w:numId w:val="1"/>
+        </w:numPr>
+        <w:spacing w:after="60"/>
+      </w:pPr>
+      <w:r>
+        <w:t xml:space="preserve">Correo de queja: cliente Alfa, 3 dias, 10% proxima compra, sin reembolso, sin inventar causa.</w:t>
+      </w:r>
+    </w:p>
+    <w:p>
+      <w:pPr>
+        <w:numPr>
+          <w:ilvl w:val="0"/>
+          <w:numId w:val="1"/>
+        </w:numPr>
+        <w:spacing w:after="60"/>
+      </w:pPr>
+      <w:r>
+        <w:t xml:space="preserve">Minuta de patio: fila de camiones, lote humedo, radio del jueves sin dueno.</w:t>
+      </w:r>
+    </w:p>
+    <w:p>
+      <w:pPr>
+        <w:numPr>
+          <w:ilvl w:val="0"/>
+          <w:numId w:val="1"/>
+        </w:numPr>
+        <w:spacing w:after="60"/>
+      </w:pPr>
+      <w:r>
+        <w:t xml:space="preserve">Excel: =A2*B2 y tres celdas a mano. Si hay texto, Excel falla.</w:t>
+      </w:r>
+    </w:p>
+    <w:p>
+      <w:pPr>
+        <w:numPr>
+          <w:ilvl w:val="0"/>
+          <w:numId w:val="1"/>
+        </w:numPr>
+        <w:spacing w:after="60"/>
+      </w:pPr>
+      <w:r>
+        <w:t xml:space="preserve">PPT a comite: 6 slides, [CIFRA OFICIAL], maximo 3 vinetas.</w:t>
       </w:r>
     </w:p>
     <w:p>
@@ -47,7 +109,7 @@
         <w:spacing w:after="60"/>
       </w:pPr>
       <w:r>
-        <w:t xml:space="preserve">Copia el prompt de tu caso (Conocernos o Proyecto final).</w:t>
+        <w:t xml:space="preserve">Copia del laboratorio (Manual o Comparador), pega en ChatGPT y el mismo texto en Claude.</w:t>
       </w:r>
     </w:p>
     <w:p>
@@ -59,7 +121,7 @@
         <w:spacing w:after="60"/>
       </w:pPr>
       <w:r>
-        <w:t xml:space="preserve">Pégalo en ChatGPT y luego el mismo texto en Claude.</w:t>
+        <w:t xml:space="preserve">ChatGPT suele ir mas listo para enviar; Claude suele marcar huecos. Tu eliges por el caso.</w:t>
       </w:r>
     </w:p>
     <w:p>
@@ -71,7 +133,7 @@
         <w:spacing w:after="60"/>
       </w:pPr>
       <w:r>
-        <w:t xml:space="preserve">Verifica cifras y normas fuera del chat.</w:t>
+        <w:t xml:space="preserve">Verifica cifras y normas fuera del chat. Plantillas largas: menu Manual prompts.</w:t>
       </w:r>
     </w:p>
     <w:sectPr>

</xml_diff>